<commit_message>
docs: remove unresolved Strategy Evaluation references
</commit_message>
<xml_diff>
--- a/docs/IT-027-001 — Strategy Domain Model MVP.docx
+++ b/docs/IT-027-001 — Strategy Domain Model MVP.docx
@@ -2705,7 +2705,7 @@
           <w:bCs w:val="1"/>
           <w:rtl w:val="0"/>
         </w:rPr>
-        <w:t xml:space="preserve">IT-027-004 — Strategy Evaluation Publication MVP</w:t>
+        <w:t xml:space="preserve">Incremento posterior — Strategy Evaluation Publication MVP</w:t>
         <w:br w:type="textWrapping"/>
       </w:r>
       <w:r>
@@ -2730,7 +2730,7 @@
           <w:bCs w:val="1"/>
           <w:rtl w:val="0"/>
         </w:rPr>
-        <w:t xml:space="preserve">IT-027-005 — Strategy Evaluation Lifecycle MVP</w:t>
+        <w:t xml:space="preserve">Incremento posterior — Strategy Evaluation Lifecycle MVP</w:t>
         <w:br w:type="textWrapping"/>
       </w:r>
       <w:r>

</xml_diff>